<commit_message>
Update docs/MS_Thesis_Complete_Aligned_Latest.docx (Scientifically Validated & Audited)
</commit_message>
<xml_diff>
--- a/docs/MS_Thesis_Complete_Aligned_Latest.docx
+++ b/docs/MS_Thesis_Complete_Aligned_Latest.docx
@@ -1590,7 +1590,7 @@
               <w:spacing w:before="80" w:after="80"/>
             </w:pPr>
             <w:r>
-              <w:t>5,475,609 eps</w:t>
+              <w:t>4,017,897 eps</w:t>
             </w:r>
           </w:p>
         </w:tc>
@@ -1621,7 +1621,7 @@
               <w:spacing w:before="80" w:after="80"/>
             </w:pPr>
             <w:r>
-              <w:t>100.00%</w:t>
+              <w:t>17.04%</w:t>
             </w:r>
           </w:p>
         </w:tc>
@@ -1634,7 +1634,7 @@
               <w:spacing w:before="80" w:after="80"/>
             </w:pPr>
             <w:r>
-              <w:t>15.14%</w:t>
+              <w:t>5.12%</w:t>
             </w:r>
           </w:p>
         </w:tc>
@@ -1647,7 +1647,7 @@
               <w:spacing w:before="80" w:after="80"/>
             </w:pPr>
             <w:r>
-              <w:t>0.2631</w:t>
+              <w:t>0.0788</w:t>
             </w:r>
           </w:p>
         </w:tc>
@@ -1660,7 +1660,7 @@
               <w:spacing w:before="80" w:after="80"/>
             </w:pPr>
             <w:r>
-              <w:t>0.00%</w:t>
+              <w:t>24.94%</w:t>
             </w:r>
           </w:p>
         </w:tc>
@@ -1673,7 +1673,7 @@
               <w:spacing w:before="80" w:after="80"/>
             </w:pPr>
             <w:r>
-              <w:t>1484.8 μs</w:t>
+              <w:t>431.2 μs</w:t>
             </w:r>
           </w:p>
         </w:tc>
@@ -1686,7 +1686,7 @@
               <w:spacing w:before="80" w:after="80"/>
             </w:pPr>
             <w:r>
-              <w:t>673 eps</w:t>
+              <w:t>2,318 eps</w:t>
             </w:r>
           </w:p>
         </w:tc>
@@ -1775,7 +1775,7 @@
               <w:spacing w:before="80" w:after="80"/>
             </w:pPr>
             <w:r>
-              <w:t>260.9 μs</w:t>
+              <w:t>261.4 μs</w:t>
             </w:r>
           </w:p>
         </w:tc>
@@ -1789,7 +1789,7 @@
               <w:spacing w:before="80" w:after="80"/>
             </w:pPr>
             <w:r>
-              <w:t>3,832 eps</w:t>
+              <w:t>3,825 eps</w:t>
             </w:r>
           </w:p>
         </w:tc>
@@ -1820,7 +1820,7 @@
               <w:spacing w:before="80" w:after="80"/>
             </w:pPr>
             <w:r>
-              <w:t>100.00%</w:t>
+              <w:t>79.75%</w:t>
             </w:r>
           </w:p>
         </w:tc>
@@ -1846,7 +1846,7 @@
               <w:spacing w:before="80" w:after="80"/>
             </w:pPr>
             <w:r>
-              <w:t>1.0000</w:t>
+              <w:t>0.8874</w:t>
             </w:r>
           </w:p>
         </w:tc>
@@ -1859,7 +1859,7 @@
               <w:spacing w:before="80" w:after="80"/>
             </w:pPr>
             <w:r>
-              <w:t>0.00%</w:t>
+              <w:t>25.39%</w:t>
             </w:r>
           </w:p>
         </w:tc>
@@ -1872,7 +1872,7 @@
               <w:spacing w:before="80" w:after="80"/>
             </w:pPr>
             <w:r>
-              <w:t>13.7 μs</w:t>
+              <w:t>17.1 μs</w:t>
             </w:r>
           </w:p>
         </w:tc>
@@ -1885,7 +1885,7 @@
               <w:spacing w:before="80" w:after="80"/>
             </w:pPr>
             <w:r>
-              <w:t>72,893 eps</w:t>
+              <w:t>58,660 eps</w:t>
             </w:r>
           </w:p>
         </w:tc>
@@ -1918,7 +1918,7 @@
               <w:spacing w:before="80" w:after="80"/>
             </w:pPr>
             <w:r>
-              <w:t>100.00%</w:t>
+              <w:t>73.97%</w:t>
             </w:r>
           </w:p>
         </w:tc>
@@ -1946,7 +1946,7 @@
               <w:spacing w:before="80" w:after="80"/>
             </w:pPr>
             <w:r>
-              <w:t>1.0000</w:t>
+              <w:t>0.8504</w:t>
             </w:r>
           </w:p>
         </w:tc>
@@ -1960,7 +1960,7 @@
               <w:spacing w:before="80" w:after="80"/>
             </w:pPr>
             <w:r>
-              <w:t>0.00%</w:t>
+              <w:t>35.19%</w:t>
             </w:r>
           </w:p>
         </w:tc>
@@ -1974,7 +1974,7 @@
               <w:spacing w:before="80" w:after="80"/>
             </w:pPr>
             <w:r>
-              <w:t>23.9 μs</w:t>
+              <w:t>28.5 μs</w:t>
             </w:r>
           </w:p>
         </w:tc>
@@ -1988,7 +1988,7 @@
               <w:spacing w:before="80" w:after="80"/>
             </w:pPr>
             <w:r>
-              <w:t>41,892 eps</w:t>
+              <w:t>35,141 eps</w:t>
             </w:r>
           </w:p>
         </w:tc>

</xml_diff>